<commit_message>
Add system use case diagram to project report
</commit_message>
<xml_diff>
--- a/docs/bao_cao_do_an_tu_van_tuyen_sinh_cmcu.docx
+++ b/docs/bao_cao_do_an_tu_van_tuyen_sinh_cmcu.docx
@@ -3251,6 +3251,82 @@
           <w:sz w:val="28"/>
         </w:rPr>
         <w:t>2.4. Use case tổng quan</w:t>
+      </w:r>
+    </w:p>
+    <w:p>
+      <w:pPr>
+        <w:jc w:val="both"/>
+      </w:pPr>
+      <w:r>
+        <w:rPr>
+          <w:sz w:val="24"/>
+        </w:rPr>
+        <w:t>Sơ đồ use case tổng quan mô tả ba nhóm tác nhân chính gồm người dùng, quản trị viên và nhân viên tư vấn; đồng thời thể hiện các chức năng mà từng nhóm trực tiếp thực hiện trong hệ thống.</w:t>
+      </w:r>
+    </w:p>
+    <w:p>
+      <w:pPr>
+        <w:spacing w:before="120" w:after="80"/>
+        <w:jc w:val="center"/>
+      </w:pPr>
+      <w:r>
+        <w:drawing>
+          <wp:inline xmlns:a="http://schemas.openxmlformats.org/drawingml/2006/main" xmlns:pic="http://schemas.openxmlformats.org/drawingml/2006/picture">
+            <wp:extent cx="5806440" cy="3974543"/>
+            <wp:docPr id="1" name="Picture 1"/>
+            <wp:cNvGraphicFramePr>
+              <a:graphicFrameLocks noChangeAspect="1"/>
+            </wp:cNvGraphicFramePr>
+            <a:graphic>
+              <a:graphicData uri="http://schemas.openxmlformats.org/drawingml/2006/picture">
+                <pic:pic>
+                  <pic:nvPicPr>
+                    <pic:cNvPr id="0" name="use_case_tong_quan_cmcu.png"/>
+                    <pic:cNvPicPr/>
+                  </pic:nvPicPr>
+                  <pic:blipFill>
+                    <a:blip r:embed="rId11"/>
+                    <a:stretch>
+                      <a:fillRect/>
+                    </a:stretch>
+                  </pic:blipFill>
+                  <pic:spPr>
+                    <a:xfrm>
+                      <a:off x="0" y="0"/>
+                      <a:ext cx="5806440" cy="3974543"/>
+                    </a:xfrm>
+                    <a:prstGeom prst="rect"/>
+                  </pic:spPr>
+                </pic:pic>
+              </a:graphicData>
+            </a:graphic>
+          </wp:inline>
+        </w:drawing>
+      </w:r>
+    </w:p>
+    <w:p>
+      <w:pPr>
+        <w:spacing w:before="0" w:after="160"/>
+        <w:jc w:val="center"/>
+      </w:pPr>
+      <w:r>
+        <w:rPr>
+          <w:b/>
+          <w:sz w:val="22"/>
+        </w:rPr>
+        <w:t>Hình 2.3. Use case tổng quan của hệ thống</w:t>
+      </w:r>
+    </w:p>
+    <w:p>
+      <w:pPr>
+        <w:spacing w:after="160"/>
+        <w:jc w:val="both"/>
+      </w:pPr>
+      <w:r>
+        <w:rPr>
+          <w:sz w:val="24"/>
+        </w:rPr>
+        <w:t>Người dùng có thể đăng nhập, tra cứu ngành, đặt câu hỏi cho chatbot RAG và gửi phản hồi. Quản trị viên chịu trách nhiệm quản lý tài khoản, nạp tài liệu và chạy đánh giá RAG. Nhân viên tư vấn tham gia xử lý các yêu cầu hỗ trợ được chuyển tiếp từ chatbot.</w:t>
       </w:r>
     </w:p>
     <w:tbl>
@@ -4164,6 +4240,7 @@
     <w:p>
       <w:pPr>
         <w:pStyle w:val="Heading2"/>
+        <w:keepNext/>
         <w:spacing w:before="240" w:after="120" w:line="300" w:lineRule="auto"/>
       </w:pPr>
       <w:r>

</xml_diff>